<commit_message>
Added new final edition of S-201
</commit_message>
<xml_diff>
--- a/artifacts/Product Specifications/S-201 Aids to Navigation Information/2.0.0/1. S-201 2.0.0 overview.docx
+++ b/artifacts/Product Specifications/S-201 Aids to Navigation Information/2.0.0/1. S-201 2.0.0 overview.docx
@@ -394,6 +394,8 @@
           <w:lang w:eastAsia="ar-SA"/>
         </w:rPr>
       </w:pPr>
+      <w:bookmarkStart w:id="0" w:name="_GoBack"/>
+      <w:bookmarkEnd w:id="0"/>
     </w:p>
     <w:p>
       <w:pPr>
@@ -450,12 +452,8 @@
       </w:r>
       <w:r>
         <w:rPr>
-          <w:rFonts w:ascii="Arial" w:eastAsia="Times New Roman" w:hAnsi="Arial" w:cs="Arial"/>
-          <w:b/>
-          <w:color w:val="000000"/>
+          <w:b/>
           <w:sz w:val="28"/>
-          <w:szCs w:val="24"/>
-          <w:lang w:eastAsia="ar-SA"/>
         </w:rPr>
         <w:t>2</w:t>
       </w:r>
@@ -1260,7 +1258,7 @@
                 <w:szCs w:val="24"/>
                 <w:lang w:val="en-CA" w:eastAsia="hi-IN" w:bidi="hi-IN"/>
               </w:rPr>
-              <w:t>Annex B 1 Data Product Format, Schemas</w:t>
+              <w:t>Annex B Data Product Format, Schemas</w:t>
             </w:r>
           </w:p>
         </w:tc>
@@ -1353,7 +1351,7 @@
                 <w:szCs w:val="24"/>
                 <w:lang w:val="en-CA" w:eastAsia="hi-IN" w:bidi="hi-IN"/>
               </w:rPr>
-              <w:t xml:space="preserve"> 1 Feature Catalogue</w:t>
+              <w:t>1 Feature Catalogue</w:t>
             </w:r>
           </w:p>
         </w:tc>
@@ -1436,7 +1434,7 @@
                 <w:szCs w:val="24"/>
                 <w:lang w:val="en-CA" w:eastAsia="hi-IN" w:bidi="hi-IN"/>
               </w:rPr>
-              <w:t>C</w:t>
+              <w:t>C2</w:t>
             </w:r>
             <w:r>
               <w:rPr>
@@ -1446,7 +1444,7 @@
                 <w:szCs w:val="24"/>
                 <w:lang w:val="en-CA" w:eastAsia="hi-IN" w:bidi="hi-IN"/>
               </w:rPr>
-              <w:t xml:space="preserve"> 2 Feature Catalogue XML</w:t>
+              <w:t xml:space="preserve"> Feature Catalogue XML</w:t>
             </w:r>
           </w:p>
         </w:tc>
@@ -1552,17 +1550,7 @@
                 <w:szCs w:val="24"/>
                 <w:lang w:val="en-CA" w:eastAsia="hi-IN" w:bidi="hi-IN"/>
               </w:rPr>
-              <w:t>D</w:t>
-            </w:r>
-            <w:r>
-              <w:rPr>
-                <w:rFonts w:ascii="Times New Roman" w:eastAsia="SimSun" w:hAnsi="Times New Roman" w:cs="Arial"/>
-                <w:kern w:val="1"/>
-                <w:sz w:val="24"/>
-                <w:szCs w:val="24"/>
-                <w:lang w:val="en-CA" w:eastAsia="hi-IN" w:bidi="hi-IN"/>
-              </w:rPr>
-              <w:t xml:space="preserve"> Portrayal Catalogue</w:t>
+              <w:t>D Portrayal Catalogue</w:t>
             </w:r>
           </w:p>
         </w:tc>
@@ -1598,17 +1586,7 @@
                 <w:szCs w:val="24"/>
                 <w:lang w:val="en-CA" w:eastAsia="hi-IN" w:bidi="hi-IN"/>
               </w:rPr>
-              <w:t xml:space="preserve">The package contains </w:t>
-            </w:r>
-            <w:r>
-              <w:rPr>
-                <w:rFonts w:ascii="Times New Roman" w:eastAsia="SimSun" w:hAnsi="Times New Roman" w:cs="Arial"/>
-                <w:kern w:val="1"/>
-                <w:sz w:val="24"/>
-                <w:szCs w:val="24"/>
-                <w:lang w:val="en-CA" w:eastAsia="hi-IN" w:bidi="hi-IN"/>
-              </w:rPr>
-              <w:t xml:space="preserve">the S-201 portrayal catalogue. </w:t>
+              <w:t xml:space="preserve">The package contains the S-201 portrayal catalogue. </w:t>
             </w:r>
           </w:p>
         </w:tc>
@@ -1635,7 +1613,7 @@
         <w:suppressAutoHyphens/>
         <w:spacing w:after="0" w:line="240" w:lineRule="auto"/>
         <w:rPr>
-          <w:rFonts w:ascii="Times New Roman" w:eastAsia="SimSun" w:hAnsi="Times New Roman" w:cs="Mangal" w:hint="eastAsia"/>
+          <w:rFonts w:ascii="Times New Roman" w:eastAsia="SimSun" w:hAnsi="Times New Roman" w:cs="Mangal"/>
           <w:kern w:val="1"/>
           <w:sz w:val="24"/>
           <w:szCs w:val="24"/>
@@ -1643,8 +1621,6 @@
           <w:lang w:val="en-CA" w:eastAsia="hi-IN" w:bidi="hi-IN"/>
         </w:rPr>
       </w:pPr>
-      <w:bookmarkStart w:id="0" w:name="_GoBack"/>
-      <w:bookmarkEnd w:id="0"/>
     </w:p>
     <w:p>
       <w:pPr>

</xml_diff>